<commit_message>
Cite the 2 mm acceptability threshold and package high-resolution figures
The methods section now justifies the 2 mm clinical acceptability limit
with five PubMed-verified references and adds a reference list. Figures
are saved at 600 dpi (PNG, LZW TIFF) and as vector PDF, and
make_package.py zips the report, result tables and figures.

Co-Authored-By: Claude Opus 5.5 <noreply@anthropic.com>
Claude-Session: https://claude.ai/code/session_011ixJqjQiZL3FD2Cpw4LJzm
</commit_message>
<xml_diff>
--- a/orthognathic_2d_vs_3d/output/Statistical_Methodology_and_Results.docx
+++ b/orthognathic_2d_vs_3d/output/Statistical_Methodology_and_Results.docx
@@ -185,7 +185,7 @@
         <w:jc w:val="both"/>
       </w:pPr>
       <w:r>
-        <w:t xml:space="preserve">A prediction error of ≤ 2 mm was considered clinically acceptable. The proportions of clinically acceptable predictions with 2D and 3D planning were compared at each landmark with the exact McNemar test for paired proportions.</w:t>
+        <w:t xml:space="preserve">A prediction error of ≤ 2 mm was considered clinically acceptable. This is the threshold most commonly used to judge the accuracy of soft-tissue prediction after orthognathic surgery, for both 2D and 3D planning (1–5), including Dolphin prediction in Class III patients treated with maxillary advancement and mandibular setback (4); it is a clinical convention rather than a statistically derived value. The proportions of clinically acceptable predictions with 2D and 3D planning were compared at each landmark with the exact McNemar test for paired proportions.</w:t>
       </w:r>
     </w:p>
     <w:p>
@@ -11118,6 +11118,79 @@
       </w:pPr>
       <w:r>
         <w:t xml:space="preserve">60% of 3D predictions versus 20% of 2D predictions were within the clinically acceptable limit of 2 mm.</w:t>
+      </w:r>
+    </w:p>
+    <w:p>
+      <w:pPr>
+        <w:pStyle w:val="Heading1"/>
+      </w:pPr>
+      <w:r>
+        <w:t xml:space="preserve">References</w:t>
+      </w:r>
+    </w:p>
+    <w:p>
+      <w:pPr>
+        <w:pStyle w:val="ListParagraph"/>
+        <w:numPr>
+          <w:ilvl w:val="0"/>
+          <w:numId w:val="3"/>
+        </w:numPr>
+        <w:spacing w:after="120" w:line="276" w:lineRule="auto"/>
+      </w:pPr>
+      <w:r>
+        <w:t xml:space="preserve">Kaipatur NR, Flores-Mir C. Accuracy of computer programs in predicting orthognathic surgery soft tissue response. J Oral Maxillofac Surg. 2009;67(4):751-9. doi:10.1016/j.joms.2008.11.006</w:t>
+      </w:r>
+    </w:p>
+    <w:p>
+      <w:pPr>
+        <w:pStyle w:val="ListParagraph"/>
+        <w:numPr>
+          <w:ilvl w:val="0"/>
+          <w:numId w:val="3"/>
+        </w:numPr>
+        <w:spacing w:after="120" w:line="276" w:lineRule="auto"/>
+      </w:pPr>
+      <w:r>
+        <w:t xml:space="preserve">Khambay B, Ullah R. Current methods of assessing the accuracy of three-dimensional soft tissue facial predictions: technical and clinical considerations. Int J Oral Maxillofac Surg. 2015;44(1):132-8. doi:10.1016/j.ijom.2014.04.007</w:t>
+      </w:r>
+    </w:p>
+    <w:p>
+      <w:pPr>
+        <w:pStyle w:val="ListParagraph"/>
+        <w:numPr>
+          <w:ilvl w:val="0"/>
+          <w:numId w:val="3"/>
+        </w:numPr>
+        <w:spacing w:after="120" w:line="276" w:lineRule="auto"/>
+      </w:pPr>
+      <w:r>
+        <w:t xml:space="preserve">Liebregts J, Xi T, Timmermans M, de Koning M, Bergé S, Hoppenreijs T, et al. Accuracy of three-dimensional soft tissue simulation in bimaxillary osteotomies. J Craniomaxillofac Surg. 2015;43(3):329-35. doi:10.1016/j.jcms.2014.12.012</w:t>
+      </w:r>
+    </w:p>
+    <w:p>
+      <w:pPr>
+        <w:pStyle w:val="ListParagraph"/>
+        <w:numPr>
+          <w:ilvl w:val="0"/>
+          <w:numId w:val="3"/>
+        </w:numPr>
+        <w:spacing w:after="120" w:line="276" w:lineRule="auto"/>
+      </w:pPr>
+      <w:r>
+        <w:t xml:space="preserve">Peterman RJ, Jiang S, Johe R, Mukherjee PM. Accuracy of Dolphin visual treatment objective (VTO) prediction software on class III patients treated with maxillary advancement and mandibular setback. Prog Orthod. 2016;17(1):19. doi:10.1186/s40510-016-0132-2</w:t>
+      </w:r>
+    </w:p>
+    <w:p>
+      <w:pPr>
+        <w:pStyle w:val="ListParagraph"/>
+        <w:numPr>
+          <w:ilvl w:val="0"/>
+          <w:numId w:val="3"/>
+        </w:numPr>
+        <w:spacing w:after="120" w:line="276" w:lineRule="auto"/>
+      </w:pPr>
+      <w:r>
+        <w:t xml:space="preserve">Yamashita AL, Iwaki Filho L, Ferraz FWDS, Ramos AL, Previdelli ITDS, Pereira OCN, et al. Accuracy of three-dimensional soft tissue profile prediction in orthognathic surgery. Oral Maxillofac Surg. 2022;26(2):271-9. doi:10.1007/s10006-021-00988-2</w:t>
       </w:r>
     </w:p>
     <w:sectPr>
@@ -11298,6 +11371,18 @@
     <w:multiLevelType w:val="hybridMultilevel"/>
     <w:lvl w:ilvl="0" w15:tentative="1">
       <w:start w:val="1"/>
+      <w:numFmt w:val="decimal"/>
+      <w:lvlText w:val="%1."/>
+      <w:lvlJc w:val="left"/>
+      <w:pPr>
+        <w:ind w:left="440" w:hanging="440"/>
+      </w:pPr>
+    </w:lvl>
+  </w:abstractNum>
+  <w:abstractNum w:abstractNumId="3" w15:restartNumberingAfterBreak="0">
+    <w:multiLevelType w:val="hybridMultilevel"/>
+    <w:lvl w:ilvl="0" w15:tentative="1">
+      <w:start w:val="1"/>
       <w:numFmt w:val="bullet"/>
       <w:lvlText w:val="•"/>
       <w:lvlJc w:val="left"/>
@@ -11313,6 +11398,12 @@
     </w:lvlOverride>
   </w:num>
   <w:num w:numId="2">
+    <w:abstractNumId w:val="3"/>
+    <w:lvlOverride w:ilvl="0">
+      <w:startOverride w:val="1"/>
+    </w:lvlOverride>
+  </w:num>
+  <w:num w:numId="3">
     <w:abstractNumId w:val="2"/>
     <w:lvlOverride w:ilvl="0">
       <w:startOverride w:val="1"/>

</xml_diff>